<commit_message>
docs(dryruns): regenerate artifacts after the nesting fix
max_nesting_depth changed for 30 of the 87 programs across the five dry runs;
the largest correction was GnuCOBOL's CBL_OC_DUMP.cob at 5 -> 6 and CardDemo's
COTRTLIC.cbl at 4 -> 5.

No risk tier moved, at program or portfolio level -- every affected program was
already tiered by an earlier-firing rule (coverage, EXEC, ALTER or CALL), so the
nesting rule was not the deciding one anywhere in these corpora. Recording that
because 'the numbers changed but nothing downstream did' is itself the finding,
and it would be easy to imply the fix moved tiers when it did not.

Regenerated at the commit that contains the fix, so each provenance string names
the code that actually produced its numbers.

Co-Authored-By: Claude Opus 5 <noreply@anthropic.com>
Claude-Session: https://claude.ai/code/session_01DirkPAk8MFJDcux39THqcs
</commit_message>
<xml_diff>
--- a/docs/dryruns/bench_corpus/assessment.docx
+++ b/docs/dryruns/bench_corpus/assessment.docx
@@ -119,7 +119,7 @@
           </w:tcPr>
           <w:p>
             <w:r>
-              <w:t>126/126 statements supported across 5 program(s) via SUPPORTED_STATEMENTS@de7f3d1 (c1_rulebased.py sha256:0bad5dd59b092e4b); method=token_scan</w:t>
+              <w:t>126/126 statements supported across 5 program(s) via SUPPORTED_STATEMENTS@2823e78 (c1_rulebased.py sha256:0bad5dd59b092e4b); method=token_scan</w:t>
             </w:r>
           </w:p>
         </w:tc>
@@ -203,7 +203,7 @@
           </w:tcPr>
           <w:p>
             <w:r>
-              <w:t>distinct code lines carrying &gt;=1 construct outside SUPPORTED_STATEMENTS@de7f3d1 (c1_rulebased.py sha256:0bad5dd59b092e4b) across 5 program(s)</w:t>
+              <w:t>distinct code lines carrying &gt;=1 construct outside SUPPORTED_STATEMENTS@2823e78 (c1_rulebased.py sha256:0bad5dd59b092e4b) across 5 program(s)</w:t>
             </w:r>
           </w:p>
         </w:tc>
@@ -1776,7 +1776,7 @@
           </w:tcPr>
           <w:p>
             <w:r>
-              <w:t>25/25 statements supported via SUPPORTED_STATEMENTS@de7f3d1 (c1_rulebased.py sha256:0bad5dd59b092e4b) on P01_payroll/program.cbl (sha256:a4b0d32852a107ab); method=token_scan, source_format=fixed; antlr_syntax_errors=11</w:t>
+              <w:t>25/25 statements supported via SUPPORTED_STATEMENTS@2823e78 (c1_rulebased.py sha256:0bad5dd59b092e4b) on P01_payroll/program.cbl (sha256:a4b0d32852a107ab); method=token_scan, source_format=fixed; antlr_syntax_errors=11</w:t>
             </w:r>
           </w:p>
         </w:tc>
@@ -1818,7 +1818,7 @@
           </w:tcPr>
           <w:p>
             <w:r>
-              <w:t>19/19 statements supported via SUPPORTED_STATEMENTS@de7f3d1 (c1_rulebased.py sha256:0bad5dd59b092e4b) on P02_interest/program.cbl (sha256:eca429658d4d4882); method=token_scan, source_format=fixed; antlr_syntax_errors=8</w:t>
+              <w:t>19/19 statements supported via SUPPORTED_STATEMENTS@2823e78 (c1_rulebased.py sha256:0bad5dd59b092e4b) on P02_interest/program.cbl (sha256:eca429658d4d4882); method=token_scan, source_format=fixed; antlr_syntax_errors=8</w:t>
             </w:r>
           </w:p>
         </w:tc>
@@ -1860,7 +1860,7 @@
           </w:tcPr>
           <w:p>
             <w:r>
-              <w:t>24/24 statements supported via SUPPORTED_STATEMENTS@de7f3d1 (c1_rulebased.py sha256:0bad5dd59b092e4b) on P03_eligibility/program.cbl (sha256:4d4fcb294665e67b); method=token_scan, source_format=fixed; antlr_syntax_errors=4</w:t>
+              <w:t>24/24 statements supported via SUPPORTED_STATEMENTS@2823e78 (c1_rulebased.py sha256:0bad5dd59b092e4b) on P03_eligibility/program.cbl (sha256:4d4fcb294665e67b); method=token_scan, source_format=fixed; antlr_syntax_errors=4</w:t>
             </w:r>
           </w:p>
         </w:tc>
@@ -1902,7 +1902,7 @@
           </w:tcPr>
           <w:p>
             <w:r>
-              <w:t>33/33 statements supported via SUPPORTED_STATEMENTS@de7f3d1 (c1_rulebased.py sha256:0bad5dd59b092e4b) on P04_taxtable/program.cbl (sha256:6dfa8a0461a45bd5); method=token_scan, source_format=fixed; antlr_syntax_errors=8</w:t>
+              <w:t>33/33 statements supported via SUPPORTED_STATEMENTS@2823e78 (c1_rulebased.py sha256:0bad5dd59b092e4b) on P04_taxtable/program.cbl (sha256:6dfa8a0461a45bd5); method=token_scan, source_format=fixed; antlr_syntax_errors=8</w:t>
             </w:r>
           </w:p>
         </w:tc>
@@ -1944,7 +1944,7 @@
           </w:tcPr>
           <w:p>
             <w:r>
-              <w:t>25/25 statements supported via SUPPORTED_STATEMENTS@de7f3d1 (c1_rulebased.py sha256:0bad5dd59b092e4b) on P05_validate/program.cbl (sha256:65f5d5c5402effa0); method=token_scan, source_format=fixed; antlr_syntax_errors=2</w:t>
+              <w:t>25/25 statements supported via SUPPORTED_STATEMENTS@2823e78 (c1_rulebased.py sha256:0bad5dd59b092e4b) on P05_validate/program.cbl (sha256:65f5d5c5402effa0); method=token_scan, source_format=fixed; antlr_syntax_errors=2</w:t>
             </w:r>
           </w:p>
         </w:tc>
@@ -2049,7 +2049,7 @@
           </w:tcPr>
           <w:p>
             <w:r>
-              <w:t>126/126 statements supported across 5 program(s) via SUPPORTED_STATEMENTS@de7f3d1 (c1_rulebased.py sha256:0bad5dd59b092e4b); method=token_scan</w:t>
+              <w:t>126/126 statements supported across 5 program(s) via SUPPORTED_STATEMENTS@2823e78 (c1_rulebased.py sha256:0bad5dd59b092e4b); method=token_scan</w:t>
             </w:r>
           </w:p>
         </w:tc>
@@ -2522,7 +2522,7 @@
           </w:tcPr>
           <w:p>
             <w:r>
-              <w:t>0</w:t>
+              <w:t>1</w:t>
             </w:r>
           </w:p>
         </w:tc>
@@ -3283,7 +3283,7 @@
           </w:tcPr>
           <w:p>
             <w:r>
-              <w:t>distinct code lines carrying &gt;=1 construct outside SUPPORTED_STATEMENTS@de7f3d1 (c1_rulebased.py sha256:0bad5dd59b092e4b) across 5 program(s)</w:t>
+              <w:t>distinct code lines carrying &gt;=1 construct outside SUPPORTED_STATEMENTS@2823e78 (c1_rulebased.py sha256:0bad5dd59b092e4b) across 5 program(s)</w:t>
             </w:r>
           </w:p>
         </w:tc>
@@ -3521,11 +3521,41 @@
         <w:br/>
         <w:t>``max_nesting_depth``</w:t>
         <w:br/>
-        <w:t xml:space="preserve">    Maximum depth of open scopes, incremented on ``IF`` / ``EVALUATE`` /</w:t>
+        <w:t xml:space="preserve">    Maximum depth of open scopes, tracked with a **stack** rather than a</w:t>
         <w:br/>
-        <w:t xml:space="preserve">    inline ``PERFORM`` and decremented on the matching ``END-…``. A period that</w:t>
+        <w:t xml:space="preserve">    counter. A scope is opened by ``IF``, ``EVALUATE``, ``SEARCH``, or an</w:t>
         <w:br/>
-        <w:t xml:space="preserve">    closes an unterminated ``IF`` also closes the scope.</w:t>
+        <w:t xml:space="preserve">    *inline* ``PERFORM`` — one whose loop body is written in place, recognised</w:t>
+        <w:br/>
+        <w:t xml:space="preserve">    as ``PERFORM UNTIL``, ``PERFORM VARYING``, ``PERFORM WITH TEST``,</w:t>
+        <w:br/>
+        <w:t xml:space="preserve">    ``PERFORM FOREVER``, or ``PERFORM &lt;n&gt; TIMES``. A ``PERFORM &lt;paragraph&gt;``</w:t>
+        <w:br/>
+        <w:t xml:space="preserve">    transfers control elsewhere and opens no scope here, so it does not count.</w:t>
+        <w:br/>
+        <w:br/>
+        <w:t xml:space="preserve">    A scope is closed by its own ``END-…`` terminator, and by nothing else: an</w:t>
+        <w:br/>
+        <w:t xml:space="preserve">    ``END-…`` whose opener is not on the stack is **ignored** rather than</w:t>
+        <w:br/>
+        <w:t xml:space="preserve">    decrementing the depth. That distinction is load-bearing — with a plain</w:t>
+        <w:br/>
+        <w:t xml:space="preserve">    counter, an ``END-PERFORM`` or ``END-READ`` sitting inside an outer ``IF``</w:t>
+        <w:br/>
+        <w:t xml:space="preserve">    cancels the ``IF``'s own depth, and every construct nested after it in that</w:t>
+        <w:br/>
+        <w:t xml:space="preserve">    ``IF`` is undercounted. ``END-READ``, ``END-CALL``, ``END-STRING`` and</w:t>
+        <w:br/>
+        <w:t xml:space="preserve">    ``END-UNSTRING`` are therefore inert here, because the statements they</w:t>
+        <w:br/>
+        <w:t xml:space="preserve">    terminate are not counted as opening a scope in the first place.</w:t>
+        <w:br/>
+        <w:br/>
+        <w:t xml:space="preserve">    Openers and closers are processed in the order they appear on the line, so</w:t>
+        <w:br/>
+        <w:t xml:space="preserve">    a scope opened and closed on one line still registers its depth. A period</w:t>
+        <w:br/>
+        <w:t xml:space="preserve">    ends the sentence and closes every scope still open.</w:t>
       </w:r>
     </w:p>
     <w:p>
@@ -3685,7 +3715,7 @@
     </w:p>
     <w:p>
       <w:r>
-        <w:t>Registry: `SUPPORTED_STATEMENTS@de7f3d1 (c1_rulebased.py sha256:0bad5dd59b092e4b)`</w:t>
+        <w:t>Registry: `SUPPORTED_STATEMENTS@2823e78 (c1_rulebased.py sha256:0bad5dd59b092e4b)`</w:t>
       </w:r>
     </w:p>
     <w:p>
@@ -4272,7 +4302,7 @@
           </w:tcPr>
           <w:p>
             <w:r>
-              <w:t>SUPPORTED_STATEMENTS@de7f3d1 (c1_rulebased.py sha256:0bad5dd59b092e4b)</w:t>
+              <w:t>SUPPORTED_STATEMENTS@2823e78 (c1_rulebased.py sha256:0bad5dd59b092e4b)</w:t>
             </w:r>
           </w:p>
         </w:tc>

</xml_diff>